<commit_message>
Management Review korrekturgelesen und erweitert
</commit_message>
<xml_diff>
--- a/management_reviews/2026_02_24/BigTopo Management-Review_2026-02-24.docx
+++ b/management_reviews/2026_02_24/BigTopo Management-Review_2026-02-24.docx
@@ -3406,7 +3406,7 @@
                 <w:sz w:val="18"/>
                 <w:szCs w:val="18"/>
               </w:rPr>
-              <w:t>6.2</w:t>
+              <w:t>XX</w:t>
             </w:r>
           </w:p>
         </w:tc>
@@ -3423,26 +3423,13 @@
                 <w:szCs w:val="18"/>
               </w:rPr>
             </w:pPr>
-            <w:proofErr w:type="spellStart"/>
             <w:r>
               <w:rPr>
                 <w:bCs/>
                 <w:sz w:val="18"/>
                 <w:szCs w:val="18"/>
               </w:rPr>
-              <w:t>BackBone</w:t>
-            </w:r>
-            <w:proofErr w:type="spellEnd"/>
-            <w:r>
-              <w:rPr>
-                <w:bCs/>
-                <w:sz w:val="18"/>
-                <w:szCs w:val="18"/>
-              </w:rPr>
-              <w:t xml:space="preserve"> Steiermark &amp; Carrier Salzburg - Konfiguration des DMVPN</w:t>
-            </w:r>
-            <w:r>
-              <w:t> </w:t>
+              <w:t>Absprache mit GAU/BRA</w:t>
             </w:r>
           </w:p>
         </w:tc>
@@ -3456,7 +3443,7 @@
               <w:jc w:val="center"/>
             </w:pPr>
             <w:r>
-              <w:t>2</w:t>
+              <w:t>1</w:t>
             </w:r>
           </w:p>
         </w:tc>
@@ -3470,16 +3457,7 @@
               <w:jc w:val="center"/>
             </w:pPr>
             <w:r>
-              <w:t>03</w:t>
-            </w:r>
-            <w:r>
-              <w:t>.0</w:t>
-            </w:r>
-            <w:r>
-              <w:t>3</w:t>
-            </w:r>
-            <w:r>
-              <w:t>.2026</w:t>
+              <w:t>03.03.2026</w:t>
             </w:r>
           </w:p>
         </w:tc>
@@ -3528,7 +3506,7 @@
                 <w:sz w:val="18"/>
                 <w:szCs w:val="18"/>
               </w:rPr>
-              <w:t>6.3</w:t>
+              <w:t>6.2</w:t>
             </w:r>
           </w:p>
         </w:tc>
@@ -3561,7 +3539,10 @@
                 <w:sz w:val="18"/>
                 <w:szCs w:val="18"/>
               </w:rPr>
-              <w:t xml:space="preserve"> Steiermark &amp; Carrier Salzburg - Konfiguration der BGP Peerings</w:t>
+              <w:t xml:space="preserve"> Steiermark &amp; Carrier Salzburg - Konfiguration des DMVPN</w:t>
+            </w:r>
+            <w:r>
+              <w:t> </w:t>
             </w:r>
           </w:p>
         </w:tc>
@@ -3589,7 +3570,16 @@
               <w:jc w:val="center"/>
             </w:pPr>
             <w:r>
-              <w:t>03.03.2026</w:t>
+              <w:t>03</w:t>
+            </w:r>
+            <w:r>
+              <w:t>.0</w:t>
+            </w:r>
+            <w:r>
+              <w:t>3</w:t>
+            </w:r>
+            <w:r>
+              <w:t>.2026</w:t>
             </w:r>
           </w:p>
         </w:tc>
@@ -3638,7 +3628,7 @@
                 <w:sz w:val="18"/>
                 <w:szCs w:val="18"/>
               </w:rPr>
-              <w:t>6.4</w:t>
+              <w:t>6.3</w:t>
             </w:r>
           </w:p>
         </w:tc>
@@ -3671,25 +3661,7 @@
                 <w:sz w:val="18"/>
                 <w:szCs w:val="18"/>
               </w:rPr>
-              <w:t xml:space="preserve"> Steiermark &amp; Carrier Salzburg - Konfiguration des </w:t>
-            </w:r>
-            <w:proofErr w:type="spellStart"/>
-            <w:r>
-              <w:rPr>
-                <w:bCs/>
-                <w:sz w:val="18"/>
-                <w:szCs w:val="18"/>
-              </w:rPr>
-              <w:t>NetFlow</w:t>
-            </w:r>
-            <w:proofErr w:type="spellEnd"/>
-            <w:r>
-              <w:rPr>
-                <w:bCs/>
-                <w:sz w:val="18"/>
-                <w:szCs w:val="18"/>
-              </w:rPr>
-              <w:t xml:space="preserve"> Servers</w:t>
+              <w:t xml:space="preserve"> Steiermark &amp; Carrier Salzburg - Konfiguration der BGP Peerings</w:t>
             </w:r>
           </w:p>
         </w:tc>
@@ -3703,7 +3675,7 @@
               <w:jc w:val="center"/>
             </w:pPr>
             <w:r>
-              <w:t>4</w:t>
+              <w:t>2</w:t>
             </w:r>
           </w:p>
         </w:tc>
@@ -3717,10 +3689,135 @@
               <w:jc w:val="center"/>
             </w:pPr>
             <w:r>
-              <w:t>xx</w:t>
-            </w:r>
-            <w:r>
-              <w:t>.03.2026</w:t>
+              <w:t>03.03.2026</w:t>
+            </w:r>
+          </w:p>
+        </w:tc>
+      </w:tr>
+      <w:tr>
+        <w:trPr>
+          <w:trHeight w:val="300"/>
+        </w:trPr>
+        <w:tc>
+          <w:tcPr>
+            <w:tcW w:w="1214" w:type="dxa"/>
+            <w:vAlign w:val="center"/>
+          </w:tcPr>
+          <w:p>
+            <w:pPr>
+              <w:jc w:val="center"/>
+              <w:rPr>
+                <w:sz w:val="18"/>
+                <w:szCs w:val="18"/>
+              </w:rPr>
+            </w:pPr>
+            <w:r>
+              <w:rPr>
+                <w:sz w:val="18"/>
+                <w:szCs w:val="18"/>
+              </w:rPr>
+              <w:t>MAR, DAN</w:t>
+            </w:r>
+          </w:p>
+        </w:tc>
+        <w:tc>
+          <w:tcPr>
+            <w:tcW w:w="1024" w:type="dxa"/>
+            <w:vAlign w:val="center"/>
+          </w:tcPr>
+          <w:p>
+            <w:pPr>
+              <w:jc w:val="center"/>
+              <w:rPr>
+                <w:sz w:val="18"/>
+                <w:szCs w:val="18"/>
+              </w:rPr>
+            </w:pPr>
+            <w:r>
+              <w:rPr>
+                <w:sz w:val="18"/>
+                <w:szCs w:val="18"/>
+              </w:rPr>
+              <w:t>6.4</w:t>
+            </w:r>
+          </w:p>
+        </w:tc>
+        <w:tc>
+          <w:tcPr>
+            <w:tcW w:w="4898" w:type="dxa"/>
+            <w:vAlign w:val="center"/>
+          </w:tcPr>
+          <w:p>
+            <w:pPr>
+              <w:rPr>
+                <w:bCs/>
+                <w:sz w:val="18"/>
+                <w:szCs w:val="18"/>
+              </w:rPr>
+            </w:pPr>
+            <w:proofErr w:type="spellStart"/>
+            <w:r>
+              <w:rPr>
+                <w:bCs/>
+                <w:sz w:val="18"/>
+                <w:szCs w:val="18"/>
+              </w:rPr>
+              <w:t>BackBone</w:t>
+            </w:r>
+            <w:proofErr w:type="spellEnd"/>
+            <w:r>
+              <w:rPr>
+                <w:bCs/>
+                <w:sz w:val="18"/>
+                <w:szCs w:val="18"/>
+              </w:rPr>
+              <w:t xml:space="preserve"> Steiermark &amp; Carrier Salzburg - Konfiguration des </w:t>
+            </w:r>
+            <w:proofErr w:type="spellStart"/>
+            <w:r>
+              <w:rPr>
+                <w:bCs/>
+                <w:sz w:val="18"/>
+                <w:szCs w:val="18"/>
+              </w:rPr>
+              <w:t>NetFlow</w:t>
+            </w:r>
+            <w:proofErr w:type="spellEnd"/>
+            <w:r>
+              <w:rPr>
+                <w:bCs/>
+                <w:sz w:val="18"/>
+                <w:szCs w:val="18"/>
+              </w:rPr>
+              <w:t xml:space="preserve"> Servers</w:t>
+            </w:r>
+          </w:p>
+        </w:tc>
+        <w:tc>
+          <w:tcPr>
+            <w:tcW w:w="1196" w:type="dxa"/>
+            <w:vAlign w:val="center"/>
+          </w:tcPr>
+          <w:p>
+            <w:pPr>
+              <w:jc w:val="center"/>
+            </w:pPr>
+            <w:r>
+              <w:t>4</w:t>
+            </w:r>
+          </w:p>
+        </w:tc>
+        <w:tc>
+          <w:tcPr>
+            <w:tcW w:w="1522" w:type="dxa"/>
+            <w:vAlign w:val="center"/>
+          </w:tcPr>
+          <w:p>
+            <w:pPr>
+              <w:jc w:val="center"/>
+            </w:pPr>
+            <w:r>
+              <w:t>xx.03.2026</w:t>
             </w:r>
           </w:p>
         </w:tc>
@@ -3931,7 +4028,7 @@
                       <a:effectLst/>
                       <a:extLst>
                         <a:ext uri="{C572A759-6A51-4108-AA02-DFA0A04FC94B}">
-                          <ma14:wrappingTextBoxFlag xmlns="" xmlns:ma14="http://schemas.microsoft.com/office/mac/drawingml/2011/main" xmlns:w="http://schemas.openxmlformats.org/wordprocessingml/2006/main" xmlns:w10="urn:schemas-microsoft-com:office:word" xmlns:v="urn:schemas-microsoft-com:vml" xmlns:o="urn:schemas-microsoft-com:office:office" xmlns:arto="http://schemas.microsoft.com/office/word/2006/arto"/>
+                          <ma14:wrappingTextBoxFlag xmlns:arto="http://schemas.microsoft.com/office/word/2006/arto" xmlns:o="urn:schemas-microsoft-com:office:office" xmlns:v="urn:schemas-microsoft-com:vml" xmlns:w10="urn:schemas-microsoft-com:office:word" xmlns:w="http://schemas.openxmlformats.org/wordprocessingml/2006/main" xmlns:ma14="http://schemas.microsoft.com/office/mac/drawingml/2011/main" xmlns=""/>
                         </a:ext>
                       </a:extLst>
                     </wps:spPr>
@@ -4297,7 +4394,7 @@
                       <a:effectLst/>
                       <a:extLst>
                         <a:ext uri="{C572A759-6A51-4108-AA02-DFA0A04FC94B}">
-                          <ma14:wrappingTextBoxFlag xmlns="" xmlns:ma14="http://schemas.microsoft.com/office/mac/drawingml/2011/main" xmlns:w="http://schemas.openxmlformats.org/wordprocessingml/2006/main" xmlns:w10="urn:schemas-microsoft-com:office:word" xmlns:v="urn:schemas-microsoft-com:vml" xmlns:o="urn:schemas-microsoft-com:office:office" xmlns:arto="http://schemas.microsoft.com/office/word/2006/arto"/>
+                          <ma14:wrappingTextBoxFlag xmlns:arto="http://schemas.microsoft.com/office/word/2006/arto" xmlns:o="urn:schemas-microsoft-com:office:office" xmlns:v="urn:schemas-microsoft-com:vml" xmlns:w10="urn:schemas-microsoft-com:office:word" xmlns:w="http://schemas.openxmlformats.org/wordprocessingml/2006/main" xmlns:ma14="http://schemas.microsoft.com/office/mac/drawingml/2011/main" xmlns=""/>
                         </a:ext>
                       </a:extLst>
                     </wps:spPr>
@@ -4626,10 +4723,10 @@
                             <a:effectLst/>
                             <a:extLst>
                               <a:ext uri="{FAA26D3D-D897-4be2-8F04-BA451C77F1D7}">
-                                <ma14:placeholderFlag xmlns:pic="http://schemas.openxmlformats.org/drawingml/2006/picture" xmlns:a14="http://schemas.microsoft.com/office/drawing/2010/main" xmlns="" xmlns:ma14="http://schemas.microsoft.com/office/mac/drawingml/2011/main" xmlns:w="http://schemas.openxmlformats.org/wordprocessingml/2006/main" xmlns:w10="urn:schemas-microsoft-com:office:word" xmlns:v="urn:schemas-microsoft-com:vml" xmlns:o="urn:schemas-microsoft-com:office:office" xmlns:arto="http://schemas.microsoft.com/office/word/2006/arto"/>
+                                <ma14:placeholderFlag xmlns:arto="http://schemas.microsoft.com/office/word/2006/arto" xmlns:o="urn:schemas-microsoft-com:office:office" xmlns:v="urn:schemas-microsoft-com:vml" xmlns:w10="urn:schemas-microsoft-com:office:word" xmlns:w="http://schemas.openxmlformats.org/wordprocessingml/2006/main" xmlns:ma14="http://schemas.microsoft.com/office/mac/drawingml/2011/main" xmlns="" xmlns:a14="http://schemas.microsoft.com/office/drawing/2010/main" xmlns:pic="http://schemas.openxmlformats.org/drawingml/2006/picture"/>
                               </a:ext>
                               <a:ext uri="{C572A759-6A51-4108-AA02-DFA0A04FC94B}">
-                                <ma14:wrappingTextBoxFlag xmlns:pic="http://schemas.openxmlformats.org/drawingml/2006/picture" xmlns:a14="http://schemas.microsoft.com/office/drawing/2010/main" xmlns="" xmlns:ma14="http://schemas.microsoft.com/office/mac/drawingml/2011/main" xmlns:w="http://schemas.openxmlformats.org/wordprocessingml/2006/main" xmlns:w10="urn:schemas-microsoft-com:office:word" xmlns:v="urn:schemas-microsoft-com:vml" xmlns:o="urn:schemas-microsoft-com:office:office" xmlns:arto="http://schemas.microsoft.com/office/word/2006/arto"/>
+                                <ma14:wrappingTextBoxFlag xmlns:arto="http://schemas.microsoft.com/office/word/2006/arto" xmlns:o="urn:schemas-microsoft-com:office:office" xmlns:v="urn:schemas-microsoft-com:vml" xmlns:w10="urn:schemas-microsoft-com:office:word" xmlns:w="http://schemas.openxmlformats.org/wordprocessingml/2006/main" xmlns:ma14="http://schemas.microsoft.com/office/mac/drawingml/2011/main" xmlns="" xmlns:a14="http://schemas.microsoft.com/office/drawing/2010/main" xmlns:pic="http://schemas.openxmlformats.org/drawingml/2006/picture"/>
                               </a:ext>
                             </a:extLst>
                           </wps:spPr>
@@ -4794,7 +4891,7 @@
                         </a:ln>
                         <a:extLst>
                           <a:ext uri="{FAA26D3D-D897-4be2-8F04-BA451C77F1D7}">
-                            <ma14:placeholderFlag xmlns:a14="http://schemas.microsoft.com/office/drawing/2010/main" xmlns="" xmlns:mo="http://schemas.microsoft.com/office/mac/office/2008/main" xmlns:mv="urn:schemas-microsoft-com:mac:vml" xmlns:o="urn:schemas-microsoft-com:office:office" xmlns:v="urn:schemas-microsoft-com:vml" xmlns:w10="urn:schemas-microsoft-com:office:word" xmlns:w="http://schemas.openxmlformats.org/wordprocessingml/2006/main" xmlns:ma14="http://schemas.microsoft.com/office/mac/drawingml/2011/main" xmlns:ve="http://schemas.openxmlformats.org/markup-compatibility/2006" xmlns:arto="http://schemas.microsoft.com/office/word/2006/arto"/>
+                            <ma14:placeholderFlag xmlns:arto="http://schemas.microsoft.com/office/word/2006/arto" xmlns:ve="http://schemas.openxmlformats.org/markup-compatibility/2006" xmlns:ma14="http://schemas.microsoft.com/office/mac/drawingml/2011/main" xmlns:w="http://schemas.openxmlformats.org/wordprocessingml/2006/main" xmlns:w10="urn:schemas-microsoft-com:office:word" xmlns:v="urn:schemas-microsoft-com:vml" xmlns:o="urn:schemas-microsoft-com:office:office" xmlns:mv="urn:schemas-microsoft-com:mac:vml" xmlns:mo="http://schemas.microsoft.com/office/mac/office/2008/main" xmlns="" xmlns:a14="http://schemas.microsoft.com/office/drawing/2010/main"/>
                           </a:ext>
                         </a:extLst>
                       </pic:spPr>
@@ -4853,10 +4950,10 @@
                             <a:effectLst/>
                             <a:extLst>
                               <a:ext uri="{FAA26D3D-D897-4be2-8F04-BA451C77F1D7}">
-                                <ma14:placeholderFlag xmlns:pic="http://schemas.openxmlformats.org/drawingml/2006/picture" xmlns:a14="http://schemas.microsoft.com/office/drawing/2010/main" xmlns="" xmlns:ma14="http://schemas.microsoft.com/office/mac/drawingml/2011/main" xmlns:w="http://schemas.openxmlformats.org/wordprocessingml/2006/main" xmlns:w10="urn:schemas-microsoft-com:office:word" xmlns:v="urn:schemas-microsoft-com:vml" xmlns:o="urn:schemas-microsoft-com:office:office" xmlns:arto="http://schemas.microsoft.com/office/word/2006/arto"/>
+                                <ma14:placeholderFlag xmlns:arto="http://schemas.microsoft.com/office/word/2006/arto" xmlns:o="urn:schemas-microsoft-com:office:office" xmlns:v="urn:schemas-microsoft-com:vml" xmlns:w10="urn:schemas-microsoft-com:office:word" xmlns:w="http://schemas.openxmlformats.org/wordprocessingml/2006/main" xmlns:ma14="http://schemas.microsoft.com/office/mac/drawingml/2011/main" xmlns="" xmlns:a14="http://schemas.microsoft.com/office/drawing/2010/main" xmlns:pic="http://schemas.openxmlformats.org/drawingml/2006/picture"/>
                               </a:ext>
                               <a:ext uri="{C572A759-6A51-4108-AA02-DFA0A04FC94B}">
-                                <ma14:wrappingTextBoxFlag xmlns:pic="http://schemas.openxmlformats.org/drawingml/2006/picture" xmlns:a14="http://schemas.microsoft.com/office/drawing/2010/main" xmlns="" xmlns:ma14="http://schemas.microsoft.com/office/mac/drawingml/2011/main" xmlns:w="http://schemas.openxmlformats.org/wordprocessingml/2006/main" xmlns:w10="urn:schemas-microsoft-com:office:word" xmlns:v="urn:schemas-microsoft-com:vml" xmlns:o="urn:schemas-microsoft-com:office:office" xmlns:arto="http://schemas.microsoft.com/office/word/2006/arto"/>
+                                <ma14:wrappingTextBoxFlag xmlns:arto="http://schemas.microsoft.com/office/word/2006/arto" xmlns:o="urn:schemas-microsoft-com:office:office" xmlns:v="urn:schemas-microsoft-com:vml" xmlns:w10="urn:schemas-microsoft-com:office:word" xmlns:w="http://schemas.openxmlformats.org/wordprocessingml/2006/main" xmlns:ma14="http://schemas.microsoft.com/office/mac/drawingml/2011/main" xmlns="" xmlns:a14="http://schemas.microsoft.com/office/drawing/2010/main" xmlns:pic="http://schemas.openxmlformats.org/drawingml/2006/picture"/>
                               </a:ext>
                             </a:extLst>
                           </wps:spPr>
@@ -8801,6 +8898,7 @@
   <w:style w:type="character" w:default="1" w:styleId="Absatz-Standardschriftart">
     <w:name w:val="Default Paragraph Font"/>
     <w:uiPriority w:val="1"/>
+    <w:semiHidden/>
     <w:unhideWhenUsed/>
   </w:style>
   <w:style w:type="table" w:default="1" w:styleId="NormaleTabelle">
@@ -13218,19 +13316,6 @@
 </file>
 
 <file path=customXml/item1.xml><?xml version="1.0" encoding="utf-8"?>
-<b:Sources xmlns:b="http://schemas.openxmlformats.org/officeDocument/2006/bibliography" xmlns="http://schemas.openxmlformats.org/officeDocument/2006/bibliography" SelectedStyle="/APA.XSL" StyleName="APA"/>
-</file>
-
-<file path=customXml/item2.xml><?xml version="1.0" encoding="utf-8"?>
-<?mso-contentType ?>
-<FormTemplates xmlns="http://schemas.microsoft.com/sharepoint/v3/contenttype/forms">
-  <Display>DocumentLibraryForm</Display>
-  <Edit>DocumentLibraryForm</Edit>
-  <New>DocumentLibraryForm</New>
-</FormTemplates>
-</file>
-
-<file path=customXml/item3.xml><?xml version="1.0" encoding="utf-8"?>
 <ct:contentTypeSchema xmlns:ct="http://schemas.microsoft.com/office/2006/metadata/contentType" xmlns:ma="http://schemas.microsoft.com/office/2006/metadata/properties/metaAttributes" ct:_="" ma:_="" ma:contentTypeName="Dokument" ma:contentTypeID="0x010100C56A913C143E084693D02B7B938376B7" ma:contentTypeVersion="11" ma:contentTypeDescription="Ein neues Dokument erstellen." ma:contentTypeScope="" ma:versionID="e420ba60ddec821319165ca892c96d60">
   <xsd:schema xmlns:xsd="http://www.w3.org/2001/XMLSchema" xmlns:xs="http://www.w3.org/2001/XMLSchema" xmlns:p="http://schemas.microsoft.com/office/2006/metadata/properties" xmlns:ns2="159292f5-ae7d-4772-aea3-467c4dd88844" xmlns:ns3="7d515a82-4a64-4446-81fe-2caa98805c6c" targetNamespace="http://schemas.microsoft.com/office/2006/metadata/properties" ma:root="true" ma:fieldsID="3ea8a233abcbb76804987009ef2ed4b5" ns2:_="" ns3:_="">
     <xsd:import namespace="159292f5-ae7d-4772-aea3-467c4dd88844"/>
@@ -13425,6 +13510,19 @@
 </ct:contentTypeSchema>
 </file>
 
+<file path=customXml/item2.xml><?xml version="1.0" encoding="utf-8"?>
+<?mso-contentType ?>
+<FormTemplates xmlns="http://schemas.microsoft.com/sharepoint/v3/contenttype/forms">
+  <Display>DocumentLibraryForm</Display>
+  <Edit>DocumentLibraryForm</Edit>
+  <New>DocumentLibraryForm</New>
+</FormTemplates>
+</file>
+
+<file path=customXml/item3.xml><?xml version="1.0" encoding="utf-8"?>
+<b:Sources xmlns:b="http://schemas.openxmlformats.org/officeDocument/2006/bibliography" xmlns="http://schemas.openxmlformats.org/officeDocument/2006/bibliography" SelectedStyle="/APA.XSL" StyleName="APA"/>
+</file>
+
 <file path=customXml/item4.xml><?xml version="1.0" encoding="utf-8"?>
 <p:properties xmlns:p="http://schemas.microsoft.com/office/2006/metadata/properties" xmlns:xsi="http://www.w3.org/2001/XMLSchema-instance" xmlns:pc="http://schemas.microsoft.com/office/infopath/2007/PartnerControls">
   <documentManagement>
@@ -13437,22 +13535,6 @@
 </file>
 
 <file path=customXml/itemProps1.xml><?xml version="1.0" encoding="utf-8"?>
-<ds:datastoreItem xmlns:ds="http://schemas.openxmlformats.org/officeDocument/2006/customXml" ds:itemID="{62517CB5-774D-4EDD-8943-E53181CD9A08}">
-  <ds:schemaRefs>
-    <ds:schemaRef ds:uri="http://schemas.openxmlformats.org/officeDocument/2006/bibliography"/>
-  </ds:schemaRefs>
-</ds:datastoreItem>
-</file>
-
-<file path=customXml/itemProps2.xml><?xml version="1.0" encoding="utf-8"?>
-<ds:datastoreItem xmlns:ds="http://schemas.openxmlformats.org/officeDocument/2006/customXml" ds:itemID="{570F5EBE-0D9C-4145-B4FC-7E2A823855E0}">
-  <ds:schemaRefs>
-    <ds:schemaRef ds:uri="http://schemas.microsoft.com/sharepoint/v3/contenttype/forms"/>
-  </ds:schemaRefs>
-</ds:datastoreItem>
-</file>
-
-<file path=customXml/itemProps3.xml><?xml version="1.0" encoding="utf-8"?>
 <ds:datastoreItem xmlns:ds="http://schemas.openxmlformats.org/officeDocument/2006/customXml" ds:itemID="{66DFB964-5B1B-41CA-8A41-92D2D3916E5C}">
   <ds:schemaRefs>
     <ds:schemaRef ds:uri="http://schemas.microsoft.com/office/2006/metadata/contentType"/>
@@ -13471,6 +13553,22 @@
 </ds:datastoreItem>
 </file>
 
+<file path=customXml/itemProps2.xml><?xml version="1.0" encoding="utf-8"?>
+<ds:datastoreItem xmlns:ds="http://schemas.openxmlformats.org/officeDocument/2006/customXml" ds:itemID="{570F5EBE-0D9C-4145-B4FC-7E2A823855E0}">
+  <ds:schemaRefs>
+    <ds:schemaRef ds:uri="http://schemas.microsoft.com/sharepoint/v3/contenttype/forms"/>
+  </ds:schemaRefs>
+</ds:datastoreItem>
+</file>
+
+<file path=customXml/itemProps3.xml><?xml version="1.0" encoding="utf-8"?>
+<ds:datastoreItem xmlns:ds="http://schemas.openxmlformats.org/officeDocument/2006/customXml" ds:itemID="{62517CB5-774D-4EDD-8943-E53181CD9A08}">
+  <ds:schemaRefs>
+    <ds:schemaRef ds:uri="http://schemas.openxmlformats.org/officeDocument/2006/bibliography"/>
+  </ds:schemaRefs>
+</ds:datastoreItem>
+</file>
+
 <file path=customXml/itemProps4.xml><?xml version="1.0" encoding="utf-8"?>
 <ds:datastoreItem xmlns:ds="http://schemas.openxmlformats.org/officeDocument/2006/customXml" ds:itemID="{FEE49199-CF90-4FF6-A8F3-3BE515465CE7}">
   <ds:schemaRefs>

</xml_diff>